<commit_message>
nothing serious just perfectionsim
</commit_message>
<xml_diff>
--- a/Reports/SVM Report.docx
+++ b/Reports/SVM Report.docx
@@ -115,29 +115,27 @@
           <w:szCs w:val="32"/>
           <w:lang w:bidi="ar-EG"/>
         </w:rPr>
-        <w:t xml:space="preserve">scaled data is read using </w:t>
-      </w:r>
-      <w:proofErr w:type="gramStart"/>
-      <w:r>
-        <w:rPr>
-          <w:b/>
-          <w:bCs/>
-          <w:sz w:val="32"/>
-          <w:szCs w:val="32"/>
-          <w:lang w:bidi="ar-EG"/>
-        </w:rPr>
-        <w:t>pd.read.csv(</w:t>
-      </w:r>
-      <w:proofErr w:type="gramEnd"/>
-      <w:r>
-        <w:rPr>
-          <w:b/>
-          <w:bCs/>
-          <w:sz w:val="32"/>
-          <w:szCs w:val="32"/>
-          <w:lang w:bidi="ar-EG"/>
-        </w:rPr>
-        <w:t>) function from pandas.</w:t>
+        <w:t>scaled data is read using pd.rea</w:t>
+      </w:r>
+      <w:r>
+        <w:rPr>
+          <w:b/>
+          <w:bCs/>
+          <w:sz w:val="32"/>
+          <w:szCs w:val="32"/>
+          <w:lang w:bidi="ar-EG"/>
+        </w:rPr>
+        <w:t>d_</w:t>
+      </w:r>
+      <w:r>
+        <w:rPr>
+          <w:b/>
+          <w:bCs/>
+          <w:sz w:val="32"/>
+          <w:szCs w:val="32"/>
+          <w:lang w:bidi="ar-EG"/>
+        </w:rPr>
+        <w:t>csv() function from pandas.</w:t>
       </w:r>
     </w:p>
     <w:p>
@@ -221,29 +219,7 @@
           <w:szCs w:val="32"/>
           <w:lang w:bidi="ar-EG"/>
         </w:rPr>
-        <w:t xml:space="preserve">The </w:t>
-      </w:r>
-      <w:proofErr w:type="gramStart"/>
-      <w:r>
-        <w:rPr>
-          <w:b/>
-          <w:bCs/>
-          <w:sz w:val="32"/>
-          <w:szCs w:val="32"/>
-          <w:lang w:bidi="ar-EG"/>
-        </w:rPr>
-        <w:t>SVM.fit(</w:t>
-      </w:r>
-      <w:proofErr w:type="gramEnd"/>
-      <w:r>
-        <w:rPr>
-          <w:b/>
-          <w:bCs/>
-          <w:sz w:val="32"/>
-          <w:szCs w:val="32"/>
-          <w:lang w:bidi="ar-EG"/>
-        </w:rPr>
-        <w:t>) function is used for</w:t>
+        <w:t>The SVM.fit() function is used for</w:t>
       </w:r>
       <w:r>
         <w:rPr>

</xml_diff>